<commit_message>
added the cms spread option python script.
</commit_message>
<xml_diff>
--- a/ClassicOptionPricing/reference/NotesOnFxCallOption.docx
+++ b/ClassicOptionPricing/reference/NotesOnFxCallOption.docx
@@ -13,19 +13,7 @@
         <w:rPr>
           <w:rFonts w:ascii="Times New Roman" w:hAnsi="Times New Roman" w:cs="Times New Roman"/>
         </w:rPr>
-        <w:t>FX Call Option BS Formula</w:t>
-      </w:r>
-      <w:r>
-        <w:rPr>
-          <w:rFonts w:ascii="Times New Roman" w:hAnsi="Times New Roman" w:cs="Times New Roman"/>
-        </w:rPr>
-        <w:t xml:space="preserve"> (in term of the forward)</w:t>
-      </w:r>
-      <w:r>
-        <w:rPr>
-          <w:rFonts w:ascii="Times New Roman" w:hAnsi="Times New Roman" w:cs="Times New Roman"/>
-        </w:rPr>
-        <w:t>:</w:t>
+        <w:t>FX Call Option BS Formula (in term of the forward):</w:t>
       </w:r>
     </w:p>
     <w:p>
@@ -85,19 +73,7 @@
                 <w:rPr>
                   <w:rFonts w:ascii="Cambria Math" w:hAnsi="Cambria Math" w:cs="Times New Roman"/>
                 </w:rPr>
-                <m:t>F</m:t>
-              </m:r>
-              <m:r>
-                <w:rPr>
-                  <w:rFonts w:ascii="Cambria Math" w:hAnsi="Cambria Math" w:cs="Times New Roman"/>
-                </w:rPr>
-                <m:t>⋅</m:t>
-              </m:r>
-              <m:r>
-                <w:rPr>
-                  <w:rFonts w:ascii="Cambria Math" w:hAnsi="Cambria Math" w:cs="Times New Roman"/>
-                </w:rPr>
-                <m:t>N</m:t>
+                <m:t>F⋅N</m:t>
               </m:r>
               <m:d>
                 <m:dPr>
@@ -141,19 +117,7 @@
                 <w:rPr>
                   <w:rFonts w:ascii="Cambria Math" w:hAnsi="Cambria Math" w:cs="Times New Roman"/>
                 </w:rPr>
-                <m:t>-K</m:t>
-              </m:r>
-              <m:r>
-                <w:rPr>
-                  <w:rFonts w:ascii="Cambria Math" w:hAnsi="Cambria Math" w:cs="Times New Roman"/>
-                </w:rPr>
-                <m:t>⋅</m:t>
-              </m:r>
-              <m:r>
-                <w:rPr>
-                  <w:rFonts w:ascii="Cambria Math" w:hAnsi="Cambria Math" w:cs="Times New Roman"/>
-                </w:rPr>
-                <m:t>N</m:t>
+                <m:t>-K⋅N</m:t>
               </m:r>
               <m:d>
                 <m:dPr>
@@ -225,13 +189,7 @@
             <w:rPr>
               <w:rFonts w:ascii="Cambria Math" w:hAnsi="Cambria Math" w:cs="Times New Roman"/>
             </w:rPr>
-            <m:t>F</m:t>
-          </m:r>
-          <m:r>
-            <w:rPr>
-              <w:rFonts w:ascii="Cambria Math" w:hAnsi="Cambria Math" w:cs="Times New Roman"/>
-            </w:rPr>
-            <m:t>w</m:t>
+            <m:t>Fw</m:t>
           </m:r>
           <m:sSub>
             <m:sSubPr>
@@ -297,13 +255,7 @@
                 <w:rPr>
                   <w:rFonts w:ascii="Cambria Math" w:hAnsi="Cambria Math" w:cs="Times New Roman"/>
                 </w:rPr>
-                <m:t>S</m:t>
-              </m:r>
-              <m:r>
-                <w:rPr>
-                  <w:rFonts w:ascii="Cambria Math" w:hAnsi="Cambria Math" w:cs="Times New Roman"/>
-                </w:rPr>
-                <m:t>pot</m:t>
+                <m:t>Spot</m:t>
               </m:r>
             </m:e>
             <m:sub>
@@ -1045,7 +997,19 @@
         <w:rPr>
           <w:rFonts w:ascii="Times New Roman" w:hAnsi="Times New Roman" w:cs="Times New Roman"/>
         </w:rPr>
-        <w:t xml:space="preserve"> the using the formula above. </w:t>
+        <w:t xml:space="preserve"> </w:t>
+      </w:r>
+      <w:r>
+        <w:rPr>
+          <w:rFonts w:ascii="Times New Roman" w:hAnsi="Times New Roman" w:cs="Times New Roman"/>
+        </w:rPr>
+        <w:t>which is being</w:t>
+      </w:r>
+      <w:r>
+        <w:rPr>
+          <w:rFonts w:ascii="Times New Roman" w:hAnsi="Times New Roman" w:cs="Times New Roman"/>
+        </w:rPr>
+        <w:t xml:space="preserve"> using the formula above. </w:t>
       </w:r>
     </w:p>
     <w:p>
@@ -1104,10 +1068,19 @@
           <w:rFonts w:ascii="Times New Roman" w:hAnsi="Times New Roman" w:cs="Times New Roman"/>
         </w:rPr>
       </w:pPr>
+    </w:p>
+    <w:p>
+      <w:pPr>
+        <w:spacing w:line="300" w:lineRule="auto"/>
+        <w:rPr>
+          <w:rFonts w:ascii="Times New Roman" w:hAnsi="Times New Roman" w:cs="Times New Roman"/>
+        </w:rPr>
+      </w:pPr>
       <w:r>
         <w:rPr>
           <w:rFonts w:ascii="Times New Roman" w:hAnsi="Times New Roman" w:cs="Times New Roman"/>
         </w:rPr>
+        <w:lastRenderedPageBreak/>
         <w:t>For example, as shown in the graph,</w:t>
       </w:r>
     </w:p>
@@ -1142,7 +1115,6 @@
         <w:rPr>
           <w:rFonts w:ascii="Times New Roman" w:hAnsi="Times New Roman" w:cs="Times New Roman"/>
         </w:rPr>
-        <w:lastRenderedPageBreak/>
         <w:t xml:space="preserve">The </w:t>
       </w:r>
       <w:r>
@@ -1249,6 +1221,16 @@
                 <w:szCs w:val="20"/>
               </w:rPr>
             </w:pPr>
+            <w:r>
+              <w:rPr>
+                <w:rFonts w:ascii="Times New Roman" w:hAnsi="Times New Roman" w:cs="Times New Roman"/>
+                <w:b/>
+                <w:bCs/>
+                <w:sz w:val="20"/>
+                <w:szCs w:val="20"/>
+              </w:rPr>
+              <w:t xml:space="preserve">USDJPY </w:t>
+            </w:r>
             <w:proofErr w:type="spellStart"/>
             <w:r>
               <w:rPr>
@@ -1302,6 +1284,49 @@
             <w:vAlign w:val="center"/>
             <w:hideMark/>
           </w:tcPr>
+          <w:p>
+            <w:pPr>
+              <w:spacing w:line="300" w:lineRule="auto"/>
+              <w:jc w:val="center"/>
+              <w:rPr>
+                <w:rFonts w:ascii="Times New Roman" w:hAnsi="Times New Roman" w:cs="Times New Roman"/>
+                <w:b/>
+                <w:bCs/>
+                <w:sz w:val="20"/>
+                <w:szCs w:val="20"/>
+              </w:rPr>
+            </w:pPr>
+            <w:r>
+              <w:rPr>
+                <w:rFonts w:ascii="Times New Roman" w:hAnsi="Times New Roman" w:cs="Times New Roman"/>
+                <w:b/>
+                <w:bCs/>
+                <w:sz w:val="20"/>
+                <w:szCs w:val="20"/>
+              </w:rPr>
+              <w:t>(</w:t>
+            </w:r>
+            <w:r>
+              <w:rPr>
+                <w:rFonts w:ascii="Times New Roman" w:hAnsi="Times New Roman" w:cs="Times New Roman"/>
+                <w:b/>
+                <w:bCs/>
+                <w:sz w:val="20"/>
+                <w:szCs w:val="20"/>
+              </w:rPr>
+              <w:t>USDJPY</w:t>
+            </w:r>
+            <w:r>
+              <w:rPr>
+                <w:rFonts w:ascii="Times New Roman" w:hAnsi="Times New Roman" w:cs="Times New Roman"/>
+                <w:b/>
+                <w:bCs/>
+                <w:sz w:val="20"/>
+                <w:szCs w:val="20"/>
+              </w:rPr>
+              <w:t>)</w:t>
+            </w:r>
+          </w:p>
           <w:p>
             <w:pPr>
               <w:spacing w:line="300" w:lineRule="auto"/>

</xml_diff>